<commit_message>
feat(demo): diversify TC05-TC10 testcases with distinct purposes and advance amounts
- Keep TC01 anchor and TC01 <-> TC12 intentional duplicate unchanged
- Update TC05-TC10 with 6 distinct work purposes and 6 distinct advance amounts
- Preserve all error invariants and regression deltas:
  * TC05: line sum vs printed total delta = 500.000 VND
  * TC06: refund calculation vs declared delta = 60.000 VND
  * TC07: printed numeric total vs words delta = 260.000 VND
  * TC08: paper total higher than invoice by 260.000 VND; internal paper math consistent
  * TC09: buyer tax code 7777777777 (different company)
  * TC10: buyer tax code blank / None
- Add portable generator scripts/generate_uc3_variations.py
- Regenerate demo context pack via scripts/sinh_context_uc03.py
- Update mapping SHA256 hashes in final-case-mapping-v3.json
- Add diversification review report in docs/final/reviews/
</commit_message>
<xml_diff>
--- a/data/tham-khao/uc-03/tc05-tong-cac-dong-tren-bao-cao-khong-khop/hoa_don_dien_tu.docx
+++ b/data/tham-khao/uc-03/tc05-tong-cac-dong-tren-bao-cao-khong-khop/hoa_don_dien_tu.docx
@@ -38,12 +38,6 @@
           <w:tcPr>
             <w:tcW w:type="dxa" w:w="3532"/>
             <w:vAlign w:val="center"/>
-            <w:tcMar>
-              <w:top w:w="90" w:type="dxa"/>
-              <w:start w:w="90" w:type="dxa"/>
-              <w:bottom w:w="90" w:type="dxa"/>
-              <w:end w:w="90" w:type="dxa"/>
-            </w:tcMar>
           </w:tcPr>
           <w:p>
             <w:pPr>
@@ -53,9 +47,8 @@
             <w:r/>
             <w:r>
               <w:rPr>
-                <w:rFonts w:ascii="Times New Roman" w:hAnsi="Times New Roman" w:eastAsia="Times New Roman"/>
+                <w:rFonts w:ascii="Times New Roman" w:hAnsi="Times New Roman"/>
                 <w:b/>
-                <w:color w:val="000000"/>
                 <w:sz w:val="18"/>
               </w:rPr>
               <w:t>Mẫu số: 1C26TAA</w:t>
@@ -66,12 +59,6 @@
           <w:tcPr>
             <w:tcW w:type="dxa" w:w="3532"/>
             <w:vAlign w:val="center"/>
-            <w:tcMar>
-              <w:top w:w="90" w:type="dxa"/>
-              <w:start w:w="90" w:type="dxa"/>
-              <w:bottom w:w="90" w:type="dxa"/>
-              <w:end w:w="90" w:type="dxa"/>
-            </w:tcMar>
           </w:tcPr>
           <w:p>
             <w:pPr>
@@ -81,9 +68,8 @@
             <w:r/>
             <w:r>
               <w:rPr>
-                <w:rFonts w:ascii="Times New Roman" w:hAnsi="Times New Roman" w:eastAsia="Times New Roman"/>
+                <w:rFonts w:ascii="Times New Roman" w:hAnsi="Times New Roman"/>
                 <w:b/>
-                <w:color w:val="000000"/>
                 <w:sz w:val="18"/>
               </w:rPr>
               <w:t>Ký hiệu: IR26E</w:t>
@@ -94,12 +80,6 @@
           <w:tcPr>
             <w:tcW w:type="dxa" w:w="3532"/>
             <w:vAlign w:val="center"/>
-            <w:tcMar>
-              <w:top w:w="90" w:type="dxa"/>
-              <w:start w:w="90" w:type="dxa"/>
-              <w:bottom w:w="90" w:type="dxa"/>
-              <w:end w:w="90" w:type="dxa"/>
-            </w:tcMar>
           </w:tcPr>
           <w:p>
             <w:pPr>
@@ -109,9 +89,8 @@
             <w:r/>
             <w:r>
               <w:rPr>
-                <w:rFonts w:ascii="Times New Roman" w:hAnsi="Times New Roman" w:eastAsia="Times New Roman"/>
+                <w:rFonts w:ascii="Times New Roman" w:hAnsi="Times New Roman"/>
                 <w:b/>
-                <w:color w:val="000000"/>
                 <w:sz w:val="18"/>
               </w:rPr>
               <w:t>Số: 00000501</w:t>
@@ -131,9 +110,6 @@
         <w:t xml:space="preserve">Đơn vị bán hàng: </w:t>
       </w:r>
       <w:r>
-        <w:rPr>
-          <w:b/>
-        </w:rPr>
         <w:t>CÔNG TY TNHH THƯƠNG MẠI VÀ DỊCH VỤ MINH PHÁT</w:t>
       </w:r>
     </w:p>
@@ -148,9 +124,6 @@
         <w:t xml:space="preserve">Mã số thuế: </w:t>
       </w:r>
       <w:r>
-        <w:rPr>
-          <w:b w:val="0"/>
-        </w:rPr>
         <w:t>0101234565</w:t>
       </w:r>
     </w:p>
@@ -165,9 +138,6 @@
         <w:t xml:space="preserve">Địa chỉ: </w:t>
       </w:r>
       <w:r>
-        <w:rPr>
-          <w:b w:val="0"/>
-        </w:rPr>
         <w:t>86 Trần Thái Tông, Phường Cầu Giấy, Thành phố Hà Nội</w:t>
       </w:r>
     </w:p>
@@ -182,9 +152,6 @@
         <w:t xml:space="preserve">Đơn vị mua hàng: </w:t>
       </w:r>
       <w:r>
-        <w:rPr>
-          <w:b/>
-        </w:rPr>
         <w:t>CÔNG TY TNHH GIẢI PHÁP CÔNG NGHỆ AN THỊNH</w:t>
       </w:r>
     </w:p>
@@ -199,9 +166,6 @@
         <w:t xml:space="preserve">Mã số thuế: </w:t>
       </w:r>
       <w:r>
-        <w:rPr>
-          <w:b w:val="0"/>
-        </w:rPr>
         <w:t>0319999996</w:t>
       </w:r>
     </w:p>
@@ -216,9 +180,6 @@
         <w:t xml:space="preserve">Địa chỉ: </w:t>
       </w:r>
       <w:r>
-        <w:rPr>
-          <w:b w:val="0"/>
-        </w:rPr>
         <w:t>128 Nguyễn Văn Linh, Phường Tân Hưng, Thành phố Hồ Chí Minh</w:t>
       </w:r>
     </w:p>
@@ -233,9 +194,6 @@
         <w:t xml:space="preserve">Hình thức thanh toán: </w:t>
       </w:r>
       <w:r>
-        <w:rPr>
-          <w:b w:val="0"/>
-        </w:rPr>
         <w:t>Chuyển khoản</w:t>
       </w:r>
     </w:p>
@@ -255,20 +213,10 @@
         <w:gridCol w:w="1766"/>
       </w:tblGrid>
       <w:tr>
-        <w:trPr>
-          <w:tblHeader w:val="true"/>
-        </w:trPr>
         <w:tc>
           <w:tcPr>
-            <w:tcW w:type="dxa" w:w="510"/>
-            <w:shd w:fill="D9EAF2"/>
+            <w:tcW w:type="dxa" w:w="1766"/>
             <w:vAlign w:val="center"/>
-            <w:tcMar>
-              <w:top w:w="90" w:type="dxa"/>
-              <w:start w:w="90" w:type="dxa"/>
-              <w:bottom w:w="90" w:type="dxa"/>
-              <w:end w:w="90" w:type="dxa"/>
-            </w:tcMar>
           </w:tcPr>
           <w:p>
             <w:pPr>
@@ -278,9 +226,8 @@
             <w:r/>
             <w:r>
               <w:rPr>
-                <w:rFonts w:ascii="Times New Roman" w:hAnsi="Times New Roman" w:eastAsia="Times New Roman"/>
+                <w:rFonts w:ascii="Times New Roman" w:hAnsi="Times New Roman"/>
                 <w:b/>
-                <w:color w:val="000000"/>
                 <w:sz w:val="17"/>
               </w:rPr>
               <w:t>STT</w:t>
@@ -289,15 +236,8 @@
         </w:tc>
         <w:tc>
           <w:tcPr>
-            <w:tcW w:type="dxa" w:w="3402"/>
-            <w:shd w:fill="D9EAF2"/>
+            <w:tcW w:type="dxa" w:w="1766"/>
             <w:vAlign w:val="center"/>
-            <w:tcMar>
-              <w:top w:w="90" w:type="dxa"/>
-              <w:start w:w="90" w:type="dxa"/>
-              <w:bottom w:w="90" w:type="dxa"/>
-              <w:end w:w="90" w:type="dxa"/>
-            </w:tcMar>
           </w:tcPr>
           <w:p>
             <w:pPr>
@@ -307,9 +247,8 @@
             <w:r/>
             <w:r>
               <w:rPr>
-                <w:rFonts w:ascii="Times New Roman" w:hAnsi="Times New Roman" w:eastAsia="Times New Roman"/>
+                <w:rFonts w:ascii="Times New Roman" w:hAnsi="Times New Roman"/>
                 <w:b/>
-                <w:color w:val="000000"/>
                 <w:sz w:val="17"/>
               </w:rPr>
               <w:t>TÊN HÀNG HÓA, DỊCH VỤ</w:t>
@@ -318,15 +257,8 @@
         </w:tc>
         <w:tc>
           <w:tcPr>
-            <w:tcW w:type="dxa" w:w="794"/>
-            <w:shd w:fill="D9EAF2"/>
+            <w:tcW w:type="dxa" w:w="1766"/>
             <w:vAlign w:val="center"/>
-            <w:tcMar>
-              <w:top w:w="90" w:type="dxa"/>
-              <w:start w:w="90" w:type="dxa"/>
-              <w:bottom w:w="90" w:type="dxa"/>
-              <w:end w:w="90" w:type="dxa"/>
-            </w:tcMar>
           </w:tcPr>
           <w:p>
             <w:pPr>
@@ -336,9 +268,8 @@
             <w:r/>
             <w:r>
               <w:rPr>
-                <w:rFonts w:ascii="Times New Roman" w:hAnsi="Times New Roman" w:eastAsia="Times New Roman"/>
+                <w:rFonts w:ascii="Times New Roman" w:hAnsi="Times New Roman"/>
                 <w:b/>
-                <w:color w:val="000000"/>
                 <w:sz w:val="17"/>
               </w:rPr>
               <w:t>ĐVT</w:t>
@@ -347,15 +278,8 @@
         </w:tc>
         <w:tc>
           <w:tcPr>
-            <w:tcW w:type="dxa" w:w="624"/>
-            <w:shd w:fill="D9EAF2"/>
+            <w:tcW w:type="dxa" w:w="1766"/>
             <w:vAlign w:val="center"/>
-            <w:tcMar>
-              <w:top w:w="90" w:type="dxa"/>
-              <w:start w:w="90" w:type="dxa"/>
-              <w:bottom w:w="90" w:type="dxa"/>
-              <w:end w:w="90" w:type="dxa"/>
-            </w:tcMar>
           </w:tcPr>
           <w:p>
             <w:pPr>
@@ -365,9 +289,8 @@
             <w:r/>
             <w:r>
               <w:rPr>
-                <w:rFonts w:ascii="Times New Roman" w:hAnsi="Times New Roman" w:eastAsia="Times New Roman"/>
+                <w:rFonts w:ascii="Times New Roman" w:hAnsi="Times New Roman"/>
                 <w:b/>
-                <w:color w:val="000000"/>
                 <w:sz w:val="17"/>
               </w:rPr>
               <w:t>SL</w:t>
@@ -376,15 +299,8 @@
         </w:tc>
         <w:tc>
           <w:tcPr>
-            <w:tcW w:type="dxa" w:w="1814"/>
-            <w:shd w:fill="D9EAF2"/>
+            <w:tcW w:type="dxa" w:w="1766"/>
             <w:vAlign w:val="center"/>
-            <w:tcMar>
-              <w:top w:w="90" w:type="dxa"/>
-              <w:start w:w="90" w:type="dxa"/>
-              <w:bottom w:w="90" w:type="dxa"/>
-              <w:end w:w="90" w:type="dxa"/>
-            </w:tcMar>
           </w:tcPr>
           <w:p>
             <w:pPr>
@@ -394,9 +310,8 @@
             <w:r/>
             <w:r>
               <w:rPr>
-                <w:rFonts w:ascii="Times New Roman" w:hAnsi="Times New Roman" w:eastAsia="Times New Roman"/>
+                <w:rFonts w:ascii="Times New Roman" w:hAnsi="Times New Roman"/>
                 <w:b/>
-                <w:color w:val="000000"/>
                 <w:sz w:val="17"/>
               </w:rPr>
               <w:t>ĐƠN GIÁ</w:t>
@@ -405,15 +320,8 @@
         </w:tc>
         <w:tc>
           <w:tcPr>
-            <w:tcW w:type="dxa" w:w="2041"/>
-            <w:shd w:fill="D9EAF2"/>
+            <w:tcW w:type="dxa" w:w="1766"/>
             <w:vAlign w:val="center"/>
-            <w:tcMar>
-              <w:top w:w="90" w:type="dxa"/>
-              <w:start w:w="90" w:type="dxa"/>
-              <w:bottom w:w="90" w:type="dxa"/>
-              <w:end w:w="90" w:type="dxa"/>
-            </w:tcMar>
           </w:tcPr>
           <w:p>
             <w:pPr>
@@ -423,9 +331,8 @@
             <w:r/>
             <w:r>
               <w:rPr>
-                <w:rFonts w:ascii="Times New Roman" w:hAnsi="Times New Roman" w:eastAsia="Times New Roman"/>
+                <w:rFonts w:ascii="Times New Roman" w:hAnsi="Times New Roman"/>
                 <w:b/>
-                <w:color w:val="000000"/>
                 <w:sz w:val="17"/>
               </w:rPr>
               <w:t>THÀNH TIỀN</w:t>
@@ -438,12 +345,6 @@
           <w:tcPr>
             <w:tcW w:type="dxa" w:w="1766"/>
             <w:vAlign w:val="center"/>
-            <w:tcMar>
-              <w:top w:w="90" w:type="dxa"/>
-              <w:start w:w="90" w:type="dxa"/>
-              <w:bottom w:w="90" w:type="dxa"/>
-              <w:end w:w="90" w:type="dxa"/>
-            </w:tcMar>
           </w:tcPr>
           <w:p>
             <w:pPr>
@@ -453,9 +354,8 @@
             <w:r/>
             <w:r>
               <w:rPr>
-                <w:rFonts w:ascii="Times New Roman" w:hAnsi="Times New Roman" w:eastAsia="Times New Roman"/>
+                <w:rFonts w:ascii="Times New Roman" w:hAnsi="Times New Roman"/>
                 <w:b w:val="0"/>
-                <w:color w:val="000000"/>
                 <w:sz w:val="17"/>
               </w:rPr>
               <w:t>1</w:t>
@@ -466,12 +366,6 @@
           <w:tcPr>
             <w:tcW w:type="dxa" w:w="1766"/>
             <w:vAlign w:val="center"/>
-            <w:tcMar>
-              <w:top w:w="90" w:type="dxa"/>
-              <w:start w:w="90" w:type="dxa"/>
-              <w:bottom w:w="90" w:type="dxa"/>
-              <w:end w:w="90" w:type="dxa"/>
-            </w:tcMar>
           </w:tcPr>
           <w:p>
             <w:pPr>
@@ -481,12 +375,11 @@
             <w:r/>
             <w:r>
               <w:rPr>
-                <w:rFonts w:ascii="Times New Roman" w:hAnsi="Times New Roman" w:eastAsia="Times New Roman"/>
+                <w:rFonts w:ascii="Times New Roman" w:hAnsi="Times New Roman"/>
                 <w:b w:val="0"/>
-                <w:color w:val="000000"/>
                 <w:sz w:val="17"/>
               </w:rPr>
-              <w:t>Dịch vụ ăn uống tiếp khách</w:t>
+              <w:t>Dịch vụ ăn uống tiếp khách đối tác</w:t>
             </w:r>
           </w:p>
         </w:tc>
@@ -494,12 +387,6 @@
           <w:tcPr>
             <w:tcW w:type="dxa" w:w="1766"/>
             <w:vAlign w:val="center"/>
-            <w:tcMar>
-              <w:top w:w="90" w:type="dxa"/>
-              <w:start w:w="90" w:type="dxa"/>
-              <w:bottom w:w="90" w:type="dxa"/>
-              <w:end w:w="90" w:type="dxa"/>
-            </w:tcMar>
           </w:tcPr>
           <w:p>
             <w:pPr>
@@ -509,9 +396,8 @@
             <w:r/>
             <w:r>
               <w:rPr>
-                <w:rFonts w:ascii="Times New Roman" w:hAnsi="Times New Roman" w:eastAsia="Times New Roman"/>
+                <w:rFonts w:ascii="Times New Roman" w:hAnsi="Times New Roman"/>
                 <w:b w:val="0"/>
-                <w:color w:val="000000"/>
                 <w:sz w:val="17"/>
               </w:rPr>
               <w:t>Suất</w:t>
@@ -522,12 +408,6 @@
           <w:tcPr>
             <w:tcW w:type="dxa" w:w="1766"/>
             <w:vAlign w:val="center"/>
-            <w:tcMar>
-              <w:top w:w="90" w:type="dxa"/>
-              <w:start w:w="90" w:type="dxa"/>
-              <w:bottom w:w="90" w:type="dxa"/>
-              <w:end w:w="90" w:type="dxa"/>
-            </w:tcMar>
           </w:tcPr>
           <w:p>
             <w:pPr>
@@ -537,12 +417,11 @@
             <w:r/>
             <w:r>
               <w:rPr>
-                <w:rFonts w:ascii="Times New Roman" w:hAnsi="Times New Roman" w:eastAsia="Times New Roman"/>
+                <w:rFonts w:ascii="Times New Roman" w:hAnsi="Times New Roman"/>
                 <w:b w:val="0"/>
-                <w:color w:val="000000"/>
                 <w:sz w:val="17"/>
               </w:rPr>
-              <w:t>10</w:t>
+              <w:t>8</w:t>
             </w:r>
           </w:p>
         </w:tc>
@@ -550,12 +429,6 @@
           <w:tcPr>
             <w:tcW w:type="dxa" w:w="1766"/>
             <w:vAlign w:val="center"/>
-            <w:tcMar>
-              <w:top w:w="90" w:type="dxa"/>
-              <w:start w:w="90" w:type="dxa"/>
-              <w:bottom w:w="90" w:type="dxa"/>
-              <w:end w:w="90" w:type="dxa"/>
-            </w:tcMar>
           </w:tcPr>
           <w:p>
             <w:pPr>
@@ -565,12 +438,11 @@
             <w:r/>
             <w:r>
               <w:rPr>
-                <w:rFonts w:ascii="Times New Roman" w:hAnsi="Times New Roman" w:eastAsia="Times New Roman"/>
+                <w:rFonts w:ascii="Times New Roman" w:hAnsi="Times New Roman"/>
                 <w:b w:val="0"/>
-                <w:color w:val="000000"/>
                 <w:sz w:val="17"/>
               </w:rPr>
-              <w:t>300.000</w:t>
+              <w:t>400.000</w:t>
             </w:r>
           </w:p>
         </w:tc>
@@ -578,12 +450,6 @@
           <w:tcPr>
             <w:tcW w:type="dxa" w:w="1766"/>
             <w:vAlign w:val="center"/>
-            <w:tcMar>
-              <w:top w:w="90" w:type="dxa"/>
-              <w:start w:w="90" w:type="dxa"/>
-              <w:bottom w:w="90" w:type="dxa"/>
-              <w:end w:w="90" w:type="dxa"/>
-            </w:tcMar>
           </w:tcPr>
           <w:p>
             <w:pPr>
@@ -593,12 +459,11 @@
             <w:r/>
             <w:r>
               <w:rPr>
-                <w:rFonts w:ascii="Times New Roman" w:hAnsi="Times New Roman" w:eastAsia="Times New Roman"/>
+                <w:rFonts w:ascii="Times New Roman" w:hAnsi="Times New Roman"/>
                 <w:b w:val="0"/>
-                <w:color w:val="000000"/>
                 <w:sz w:val="17"/>
               </w:rPr>
-              <w:t>3.000.000</w:t>
+              <w:t>3.200.000</w:t>
             </w:r>
           </w:p>
         </w:tc>
@@ -606,9 +471,6 @@
     </w:tbl>
     <w:p>
       <w:pPr>
-        <w:tabs>
-          <w:tab w:pos="9071" w:val="right"/>
-        </w:tabs>
         <w:spacing w:after="40"/>
       </w:pPr>
       <w:r>
@@ -621,15 +483,11 @@
         <w:rPr>
           <w:b w:val="0"/>
         </w:rPr>
-        <w:tab/>
-        <w:t>3.000.000 VND</w:t>
+        <w:t xml:space="preserve"> 3.200.000 VND</w:t>
       </w:r>
     </w:p>
     <w:p>
       <w:pPr>
-        <w:tabs>
-          <w:tab w:pos="9071" w:val="right"/>
-        </w:tabs>
         <w:spacing w:after="40"/>
       </w:pPr>
       <w:r>
@@ -642,15 +500,11 @@
         <w:rPr>
           <w:b w:val="0"/>
         </w:rPr>
-        <w:tab/>
-        <w:t>240.000 VND</w:t>
+        <w:t xml:space="preserve"> 256.000 VND</w:t>
       </w:r>
     </w:p>
     <w:p>
       <w:pPr>
-        <w:tabs>
-          <w:tab w:pos="9071" w:val="right"/>
-        </w:tabs>
         <w:spacing w:after="40"/>
       </w:pPr>
       <w:r>
@@ -663,14 +517,10 @@
         <w:rPr>
           <w:b/>
         </w:rPr>
-        <w:tab/>
-        <w:t>3.240.000 VND</w:t>
+        <w:t xml:space="preserve"> 3.456.000 VND</w:t>
       </w:r>
     </w:p>
     <w:p>
-      <w:pPr>
-        <w:spacing w:after="40"/>
-      </w:pPr>
       <w:r>
         <w:rPr>
           <w:b/>
@@ -678,10 +528,7 @@
         <w:t xml:space="preserve">Số tiền bằng chữ: </w:t>
       </w:r>
       <w:r>
-        <w:rPr>
-          <w:b w:val="0"/>
-        </w:rPr>
-        <w:t>Ba triệu hai trăm bốn mươi nghìn đồng.</w:t>
+        <w:t>Ba triệu bốn trăm năm mươi sáu nghìn đồng.</w:t>
       </w:r>
     </w:p>
     <w:tbl>
@@ -699,24 +546,17 @@
           <w:tcPr>
             <w:tcW w:type="dxa" w:w="5298"/>
             <w:vAlign w:val="center"/>
-            <w:tcMar>
-              <w:top w:w="90" w:type="dxa"/>
-              <w:start w:w="90" w:type="dxa"/>
-              <w:bottom w:w="90" w:type="dxa"/>
-              <w:end w:w="90" w:type="dxa"/>
-            </w:tcMar>
           </w:tcPr>
           <w:p>
             <w:pPr>
-              <w:spacing w:after="480"/>
+              <w:spacing w:after="0"/>
               <w:jc w:val="center"/>
             </w:pPr>
             <w:r/>
             <w:r>
               <w:rPr>
-                <w:rFonts w:ascii="Times New Roman" w:hAnsi="Times New Roman" w:eastAsia="Times New Roman"/>
+                <w:rFonts w:ascii="Times New Roman" w:hAnsi="Times New Roman"/>
                 <w:b/>
-                <w:color w:val="000000"/>
                 <w:sz w:val="18"/>
               </w:rPr>
               <w:t>NGƯỜI MUA HÀNG</w:t>
@@ -729,24 +569,17 @@
           <w:tcPr>
             <w:tcW w:type="dxa" w:w="5298"/>
             <w:vAlign w:val="center"/>
-            <w:tcMar>
-              <w:top w:w="90" w:type="dxa"/>
-              <w:start w:w="90" w:type="dxa"/>
-              <w:bottom w:w="90" w:type="dxa"/>
-              <w:end w:w="90" w:type="dxa"/>
-            </w:tcMar>
           </w:tcPr>
           <w:p>
             <w:pPr>
-              <w:spacing w:after="480"/>
+              <w:spacing w:after="0"/>
               <w:jc w:val="center"/>
             </w:pPr>
             <w:r/>
             <w:r>
               <w:rPr>
-                <w:rFonts w:ascii="Times New Roman" w:hAnsi="Times New Roman" w:eastAsia="Times New Roman"/>
+                <w:rFonts w:ascii="Times New Roman" w:hAnsi="Times New Roman"/>
                 <w:b/>
-                <w:color w:val="000000"/>
                 <w:sz w:val="18"/>
               </w:rPr>
               <w:t>NGƯỜI BÁN HÀNG</w:t>
@@ -763,7 +596,7 @@
     </w:tbl>
     <w:sectPr>
       <w:pgSz w:w="12240" w:h="15840"/>
-      <w:pgMar w:top="765" w:right="822" w:bottom="709" w:left="822" w:header="283" w:footer="312" w:gutter="0"/>
+      <w:pgMar w:top="765" w:right="822" w:bottom="709" w:left="822" w:header="720" w:footer="720" w:gutter="0"/>
       <w:cols w:space="720"/>
       <w:docGrid w:linePitch="360"/>
     </w:sectPr>
@@ -1134,13 +967,6 @@
     <w:name w:val="Normal"/>
     <w:qFormat/>
     <w:rsid w:val="00FC693F"/>
-    <w:pPr>
-      <w:spacing w:after="80"/>
-    </w:pPr>
-    <w:rPr>
-      <w:rFonts w:ascii="Times New Roman" w:hAnsi="Times New Roman" w:eastAsia="Times New Roman"/>
-      <w:sz w:val="21"/>
-    </w:rPr>
   </w:style>
   <w:style w:type="paragraph" w:styleId="Header">
     <w:name w:val="header"/>

</xml_diff>